<commit_message>
docxgen: update approval memo and work report (15 Oct)
</commit_message>
<xml_diff>
--- a/labassist-backend/docxgen/templates/work_report.docx
+++ b/labassist-backend/docxgen/templates/work_report.docx
@@ -30,7 +30,18 @@
           <w:szCs w:val="40"/>
           <w:cs/>
         </w:rPr>
-        <w:t>รายงานผลการปฏิบัติงานของนักศึกษา</w:t>
+        <w:t>รายงานผลการปฏิบัติงาน</w:t>
+      </w:r>
+      <w:r>
+        <w:rPr>
+          <w:rFonts w:ascii="TH SarabunPSK" w:hAnsi="TH SarabunPSK" w:cs="TH SarabunPSK"/>
+          <w:b/>
+          <w:bCs/>
+          <w:sz w:val="40"/>
+          <w:szCs w:val="40"/>
+          <w:cs/>
+        </w:rPr>
+        <w:t>ของนักศึกษา</w:t>
       </w:r>
     </w:p>
     <w:p>
@@ -317,7 +328,7 @@
               <w:spacing w:line="216" w:lineRule="auto"/>
               <w:jc w:val="center"/>
               <w:rPr>
-                <w:rFonts w:ascii="TH SarabunPSK" w:hAnsi="TH SarabunPSK" w:cs="TH SarabunPSK"/>
+                <w:rFonts w:ascii="TH Sarabun New" w:hAnsi="TH Sarabun New" w:cs="TH Sarabun New"/>
                 <w:sz w:val="32"/>
                 <w:szCs w:val="32"/>
                 <w:cs/>
@@ -325,30 +336,12 @@
             </w:pPr>
             <w:r>
               <w:rPr>
-                <w:rFonts w:ascii="TH SarabunPSK" w:hAnsi="TH SarabunPSK" w:cs="TH SarabunPSK" w:hint="cs"/>
-                <w:sz w:val="32"/>
-                <w:szCs w:val="32"/>
-                <w:cs/>
-              </w:rPr>
-              <w:t xml:space="preserve">{{SESSION_DATE}}</w:t>
-            </w:r>
-            <w:r>
-              <w:rPr>
-                <w:rFonts w:ascii="TH SarabunPSK" w:hAnsi="TH SarabunPSK" w:cs="TH SarabunPSK"/>
-                <w:sz w:val="32"/>
-                <w:szCs w:val="32"/>
-                <w:cs/>
-              </w:rPr>
-              <w:t xml:space="preserve"/>
-            </w:r>
-            <w:r>
-              <w:rPr>
-                <w:rFonts w:ascii="TH SarabunPSK" w:hAnsi="TH SarabunPSK" w:cs="TH SarabunPSK" w:hint="cs"/>
-                <w:sz w:val="32"/>
-                <w:szCs w:val="32"/>
-                <w:cs/>
-              </w:rPr>
-              <w:t/>
+                <w:rFonts w:ascii="TH Sarabun New" w:hAnsi="TH Sarabun New" w:cs="TH Sarabun New"/>
+                <w:sz w:val="32"/>
+                <w:szCs w:val="32"/>
+                <w:cs/>
+              </w:rPr>
+              <w:t xml:space="preserve">{{WR_DATE}}</w:t>
             </w:r>
           </w:p>
         </w:tc>
@@ -366,46 +359,19 @@
               <w:spacing w:line="216" w:lineRule="auto"/>
               <w:jc w:val="center"/>
               <w:rPr>
-                <w:rFonts w:ascii="TH SarabunPSK" w:hAnsi="TH SarabunPSK" w:cs="TH SarabunPSK"/>
+                <w:rFonts w:ascii="TH Sarabun New" w:hAnsi="TH Sarabun New" w:cs="TH Sarabun New"/>
                 <w:sz w:val="32"/>
                 <w:szCs w:val="32"/>
               </w:rPr>
             </w:pPr>
             <w:r>
               <w:rPr>
-                <w:rFonts w:ascii="TH Sarabun New" w:hAnsi="TH Sarabun New" w:cs="TH Sarabun New" w:hint="cs"/>
-                <w:sz w:val="32"/>
-                <w:szCs w:val="32"/>
-                <w:cs/>
-              </w:rPr>
-              <w:t xml:space="preserve">{{SESSION_TIME}}</w:t>
-            </w:r>
-            <w:r>
-              <w:rPr>
                 <w:rFonts w:ascii="TH Sarabun New" w:hAnsi="TH Sarabun New" w:cs="TH Sarabun New"/>
                 <w:sz w:val="32"/>
                 <w:szCs w:val="32"/>
                 <w:cs/>
               </w:rPr>
-              <w:t xml:space="preserve"/>
-            </w:r>
-            <w:r>
-              <w:rPr>
-                <w:rFonts w:ascii="TH Sarabun New" w:hAnsi="TH Sarabun New" w:cs="TH Sarabun New" w:hint="cs"/>
-                <w:sz w:val="32"/>
-                <w:szCs w:val="32"/>
-                <w:cs/>
-              </w:rPr>
-              <w:t/>
-            </w:r>
-            <w:r>
-              <w:rPr>
-                <w:rFonts w:ascii="TH SarabunPSK" w:hAnsi="TH SarabunPSK" w:cs="TH SarabunPSK" w:hint="cs"/>
-                <w:sz w:val="32"/>
-                <w:szCs w:val="32"/>
-                <w:cs/>
-              </w:rPr>
-              <w:t xml:space="preserve"/>
+              <w:t xml:space="preserve">{{WR_TIME}}</w:t>
             </w:r>
           </w:p>
         </w:tc>
@@ -423,7 +389,7 @@
               <w:spacing w:line="216" w:lineRule="auto"/>
               <w:jc w:val="center"/>
               <w:rPr>
-                <w:rFonts w:ascii="TH SarabunPSK" w:hAnsi="TH SarabunPSK" w:cs="TH SarabunPSK"/>
+                <w:rFonts w:ascii="TH Sarabun New" w:hAnsi="TH Sarabun New" w:cs="TH Sarabun New"/>
                 <w:sz w:val="32"/>
                 <w:szCs w:val="32"/>
                 <w:cs/>
@@ -437,7 +403,7 @@
                 <w:szCs w:val="32"/>
                 <w:cs/>
               </w:rPr>
-              <w:t xml:space="preserve">{{SESSION_DESC}}</w:t>
+              <w:t xml:space="preserve">{{WR_DESC}}</w:t>
             </w:r>
           </w:p>
         </w:tc>
@@ -455,7 +421,7 @@
               <w:spacing w:line="216" w:lineRule="auto"/>
               <w:jc w:val="center"/>
               <w:rPr>
-                <w:rFonts w:ascii="TH SarabunPSK" w:hAnsi="TH SarabunPSK" w:cs="TH SarabunPSK"/>
+                <w:rFonts w:ascii="TH Sarabun New" w:hAnsi="TH Sarabun New" w:cs="TH Sarabun New"/>
                 <w:sz w:val="32"/>
                 <w:szCs w:val="32"/>
                 <w:cs/>
@@ -463,48 +429,12 @@
             </w:pPr>
             <w:r>
               <w:rPr>
-                <w:rFonts w:ascii="TH SarabunPSK" w:hAnsi="TH SarabunPSK" w:cs="TH SarabunPSK" w:hint="cs"/>
-                <w:sz w:val="32"/>
-                <w:szCs w:val="32"/>
-                <w:cs/>
-              </w:rPr>
-              <w:t xml:space="preserve"/>
-            </w:r>
-            <w:r>
-              <w:rPr>
-                <w:rFonts w:ascii="TH SarabunPSK" w:hAnsi="TH SarabunPSK" w:cs="TH SarabunPSK"/>
-                <w:sz w:val="32"/>
-                <w:szCs w:val="32"/>
-                <w:cs/>
-              </w:rPr>
-              <w:t/>
-            </w:r>
-            <w:r>
-              <w:rPr>
-                <w:rFonts w:ascii="TH SarabunPSK" w:hAnsi="TH SarabunPSK" w:cs="TH SarabunPSK" w:hint="cs"/>
-                <w:sz w:val="32"/>
-                <w:szCs w:val="32"/>
-                <w:cs/>
-              </w:rPr>
-              <w:t xml:space="preserve"/>
-            </w:r>
-            <w:r>
-              <w:rPr>
-                <w:rFonts w:ascii="TH SarabunPSK" w:hAnsi="TH SarabunPSK" w:cs="TH SarabunPSK"/>
-                <w:sz w:val="32"/>
-                <w:szCs w:val="32"/>
-                <w:cs/>
-              </w:rPr>
-              <w:t/>
-            </w:r>
-            <w:r>
-              <w:rPr>
-                <w:rFonts w:ascii="TH SarabunPSK" w:hAnsi="TH SarabunPSK" w:cs="TH SarabunPSK" w:hint="cs"/>
-                <w:sz w:val="32"/>
-                <w:szCs w:val="32"/>
-                <w:cs/>
-              </w:rPr>
-              <w:t/>
+                <w:rFonts w:ascii="TH Sarabun New" w:hAnsi="TH Sarabun New" w:cs="TH Sarabun New"/>
+                <w:sz w:val="32"/>
+                <w:szCs w:val="32"/>
+                <w:cs/>
+              </w:rPr>
+              <w:t xml:space="preserve">{{WR_NAME}}</w:t>
             </w:r>
           </w:p>
         </w:tc>
@@ -513,15 +443,10 @@
         <w:tc>
           <w:tcPr>
             <w:tcW w:w="1533" w:type="dxa"/>
-            <w:tcBorders>
-              <w:top w:val="nil"/>
-              <w:bottom w:val="nil"/>
-            </w:tcBorders>
-            <w:shd w:val="clear" w:color="auto" w:fill="auto"/>
-          </w:tcPr>
-          <w:p>
-            <w:pPr>
-              <w:spacing w:line="216" w:lineRule="auto"/>
+            <w:shd w:val="clear" w:color="auto" w:fill="auto"/>
+          </w:tcPr>
+          <w:p>
+            <w:pPr>
               <w:jc w:val="center"/>
               <w:rPr>
                 <w:rFonts w:ascii="TH SarabunPSK" w:hAnsi="TH SarabunPSK" w:cs="TH SarabunPSK"/>
@@ -535,15 +460,10 @@
         <w:tc>
           <w:tcPr>
             <w:tcW w:w="1843" w:type="dxa"/>
-            <w:tcBorders>
-              <w:top w:val="nil"/>
-              <w:bottom w:val="nil"/>
-            </w:tcBorders>
-            <w:shd w:val="clear" w:color="auto" w:fill="auto"/>
-          </w:tcPr>
-          <w:p>
-            <w:pPr>
-              <w:spacing w:line="216" w:lineRule="auto"/>
+            <w:shd w:val="clear" w:color="auto" w:fill="auto"/>
+          </w:tcPr>
+          <w:p>
+            <w:pPr>
               <w:jc w:val="center"/>
               <w:rPr>
                 <w:rFonts w:ascii="TH SarabunPSK" w:hAnsi="TH SarabunPSK" w:cs="TH SarabunPSK"/>
@@ -556,70 +476,44 @@
         <w:tc>
           <w:tcPr>
             <w:tcW w:w="4535" w:type="dxa"/>
-            <w:tcBorders>
-              <w:top w:val="nil"/>
-              <w:bottom w:val="nil"/>
-            </w:tcBorders>
-            <w:shd w:val="clear" w:color="auto" w:fill="auto"/>
-          </w:tcPr>
-          <w:p>
-            <w:pPr>
-              <w:spacing w:line="216" w:lineRule="auto"/>
-              <w:rPr>
-                <w:rFonts w:ascii="TH SarabunPSK" w:hAnsi="TH SarabunPSK" w:cs="TH SarabunPSK"/>
-                <w:sz w:val="32"/>
-                <w:szCs w:val="32"/>
-                <w:cs/>
-              </w:rPr>
-            </w:pPr>
+            <w:shd w:val="clear" w:color="auto" w:fill="auto"/>
+          </w:tcPr>
+          <w:p>
+            <w:pPr>
+              <w:jc w:val="center"/>
+              <w:rPr>
+                <w:rFonts w:ascii="TH SarabunPSK" w:hAnsi="TH SarabunPSK" w:cs="TH SarabunPSK"/>
+                <w:sz w:val="32"/>
+                <w:szCs w:val="32"/>
+                <w:cs/>
+              </w:rPr>
+            </w:pPr>
+            <w:r>
+              <w:rPr>
+                <w:rFonts w:ascii="TH SarabunPSK" w:hAnsi="TH SarabunPSK" w:cs="TH SarabunPSK" w:hint="cs"/>
+                <w:sz w:val="32"/>
+                <w:szCs w:val="32"/>
+                <w:cs/>
+              </w:rPr>
+              <w:t>ขอรับรองว่าปฏิบัติงานตามนี้จริง</w:t>
+            </w:r>
           </w:p>
         </w:tc>
         <w:tc>
           <w:tcPr>
             <w:tcW w:w="2961" w:type="dxa"/>
-            <w:tcBorders>
-              <w:top w:val="nil"/>
-              <w:bottom w:val="nil"/>
-            </w:tcBorders>
-            <w:shd w:val="clear" w:color="auto" w:fill="auto"/>
-          </w:tcPr>
-          <w:p>
-            <w:pPr>
-              <w:spacing w:line="216" w:lineRule="auto"/>
-              <w:jc w:val="center"/>
-              <w:rPr>
-                <w:rFonts w:ascii="TH Sarabun New" w:hAnsi="TH Sarabun New" w:cs="TH Sarabun New"/>
-                <w:sz w:val="32"/>
-                <w:szCs w:val="32"/>
-              </w:rPr>
-            </w:pPr>
-            <w:r>
-              <w:rPr>
-                <w:rFonts w:ascii="TH SarabunPSK" w:hAnsi="TH SarabunPSK" w:cs="TH SarabunPSK" w:hint="cs"/>
-                <w:sz w:val="32"/>
-                <w:szCs w:val="32"/>
-                <w:cs/>
-              </w:rPr>
-              <w:t xml:space="preserve">{{STUDENT_NAME}}</w:t>
-            </w:r>
-            <w:r>
-              <w:rPr>
-                <w:rFonts w:ascii="TH SarabunPSK" w:hAnsi="TH SarabunPSK" w:cs="TH SarabunPSK"/>
-                <w:sz w:val="32"/>
-                <w:szCs w:val="32"/>
-                <w:cs/>
-              </w:rPr>
-              <w:t/>
-            </w:r>
-            <w:r>
-              <w:rPr>
-                <w:rFonts w:ascii="TH SarabunPSK" w:hAnsi="TH SarabunPSK" w:cs="TH SarabunPSK" w:hint="cs"/>
-                <w:sz w:val="32"/>
-                <w:szCs w:val="32"/>
-                <w:cs/>
-              </w:rPr>
-              <w:t/>
-            </w:r>
+            <w:shd w:val="clear" w:color="auto" w:fill="auto"/>
+          </w:tcPr>
+          <w:p>
+            <w:pPr>
+              <w:jc w:val="center"/>
+              <w:rPr>
+                <w:rFonts w:ascii="TH SarabunPSK" w:hAnsi="TH SarabunPSK" w:cs="TH SarabunPSK"/>
+                <w:sz w:val="32"/>
+                <w:szCs w:val="32"/>
+                <w:cs/>
+              </w:rPr>
+            </w:pPr>
           </w:p>
         </w:tc>
       </w:tr>
@@ -672,15 +566,6 @@
                 <w:cs/>
               </w:rPr>
             </w:pPr>
-            <w:r>
-              <w:rPr>
-                <w:rFonts w:ascii="TH SarabunPSK" w:hAnsi="TH SarabunPSK" w:cs="TH SarabunPSK" w:hint="cs"/>
-                <w:sz w:val="32"/>
-                <w:szCs w:val="32"/>
-                <w:cs/>
-              </w:rPr>
-              <w:t>ขอรับรองว่าปฏิบัติงานตามนี้จริง</w:t>
-            </w:r>
           </w:p>
         </w:tc>
         <w:tc>
@@ -690,7 +575,6 @@
           </w:tcPr>
           <w:p>
             <w:pPr>
-              <w:jc w:val="center"/>
               <w:rPr>
                 <w:rFonts w:ascii="TH SarabunPSK" w:hAnsi="TH SarabunPSK" w:cs="TH SarabunPSK"/>
                 <w:sz w:val="32"/>
@@ -745,11 +629,22 @@
               <w:jc w:val="center"/>
               <w:rPr>
                 <w:rFonts w:ascii="TH SarabunPSK" w:hAnsi="TH SarabunPSK" w:cs="TH SarabunPSK"/>
-                <w:sz w:val="32"/>
-                <w:szCs w:val="32"/>
-                <w:cs/>
-              </w:rPr>
-            </w:pPr>
+                <w:color w:val="FFFFFF" w:themeColor="background1"/>
+                <w:sz w:val="32"/>
+                <w:szCs w:val="32"/>
+                <w:cs/>
+              </w:rPr>
+            </w:pPr>
+            <w:r>
+              <w:rPr>
+                <w:rFonts w:ascii="TH Sarabun New" w:hAnsi="TH Sarabun New" w:cs="TH Sarabun New"/>
+                <w:color w:val="FFFFFF" w:themeColor="background1"/>
+                <w:sz w:val="32"/>
+                <w:szCs w:val="32"/>
+                <w:cs/>
+              </w:rPr>
+              <w:t xml:space="preserve">({{DEPT_HEAD_NAME}})</w:t>
+            </w:r>
           </w:p>
         </w:tc>
         <w:tc>
@@ -813,7 +708,7 @@
               <w:jc w:val="center"/>
               <w:rPr>
                 <w:rFonts w:ascii="TH SarabunPSK" w:hAnsi="TH SarabunPSK" w:cs="TH SarabunPSK"/>
-                <w:color w:val="auto"/>
+                <w:color w:val="FFFFFF" w:themeColor="background1"/>
                 <w:sz w:val="32"/>
                 <w:szCs w:val="32"/>
                 <w:cs/>
@@ -822,126 +717,7 @@
             <w:r>
               <w:rPr>
                 <w:rFonts w:ascii="TH Sarabun New" w:hAnsi="TH Sarabun New" w:cs="TH Sarabun New"/>
-                <w:color w:val="auto"/>
-                <w:sz w:val="32"/>
-                <w:szCs w:val="32"/>
-                <w:cs/>
-              </w:rPr>
-              <w:t xml:space="preserve">({{DEPT_HEAD_NAME}})</w:t>
-            </w:r>
-            <w:r>
-              <w:rPr>
-                <w:rFonts w:ascii="TH Sarabun New" w:hAnsi="TH Sarabun New" w:cs="TH Sarabun New" w:hint="cs"/>
-                <w:color w:val="auto"/>
-                <w:sz w:val="32"/>
-                <w:szCs w:val="32"/>
-                <w:cs/>
-              </w:rPr>
-              <w:t xml:space="preserve"/>
-            </w:r>
-            <w:r>
-              <w:rPr>
-                <w:rFonts w:ascii="TH Sarabun New" w:hAnsi="TH Sarabun New" w:cs="TH Sarabun New"/>
-                <w:color w:val="auto"/>
-                <w:sz w:val="32"/>
-                <w:szCs w:val="32"/>
-                <w:cs/>
-              </w:rPr>
-              <w:t/>
-            </w:r>
-            <w:r>
-              <w:rPr>
-                <w:rFonts w:ascii="TH Sarabun New" w:hAnsi="TH Sarabun New" w:cs="TH Sarabun New" w:hint="cs"/>
-                <w:color w:val="auto"/>
-                <w:sz w:val="32"/>
-                <w:szCs w:val="32"/>
-                <w:cs/>
-              </w:rPr>
-              <w:t/>
-            </w:r>
-            <w:r>
-              <w:rPr>
-                <w:rFonts w:ascii="TH Sarabun New" w:hAnsi="TH Sarabun New" w:cs="TH Sarabun New"/>
-                <w:color w:val="auto"/>
-                <w:sz w:val="32"/>
-                <w:szCs w:val="32"/>
-                <w:cs/>
-              </w:rPr>
-              <w:t/>
-            </w:r>
-          </w:p>
-        </w:tc>
-        <w:tc>
-          <w:tcPr>
-            <w:tcW w:w="2961" w:type="dxa"/>
-            <w:shd w:val="clear" w:color="auto" w:fill="auto"/>
-          </w:tcPr>
-          <w:p>
-            <w:pPr>
-              <w:rPr>
-                <w:rFonts w:ascii="TH SarabunPSK" w:hAnsi="TH SarabunPSK" w:cs="TH SarabunPSK"/>
-                <w:sz w:val="32"/>
-                <w:szCs w:val="32"/>
-                <w:cs/>
-              </w:rPr>
-            </w:pPr>
-          </w:p>
-        </w:tc>
-      </w:tr>
-      <w:tr>
-        <w:tc>
-          <w:tcPr>
-            <w:tcW w:w="1533" w:type="dxa"/>
-            <w:shd w:val="clear" w:color="auto" w:fill="auto"/>
-          </w:tcPr>
-          <w:p>
-            <w:pPr>
-              <w:jc w:val="center"/>
-              <w:rPr>
-                <w:rFonts w:ascii="TH SarabunPSK" w:hAnsi="TH SarabunPSK" w:cs="TH SarabunPSK"/>
-                <w:sz w:val="32"/>
-                <w:szCs w:val="32"/>
-                <w:cs/>
-              </w:rPr>
-            </w:pPr>
-          </w:p>
-        </w:tc>
-        <w:tc>
-          <w:tcPr>
-            <w:tcW w:w="1843" w:type="dxa"/>
-            <w:shd w:val="clear" w:color="auto" w:fill="auto"/>
-          </w:tcPr>
-          <w:p>
-            <w:pPr>
-              <w:jc w:val="center"/>
-              <w:rPr>
-                <w:rFonts w:ascii="TH SarabunPSK" w:hAnsi="TH SarabunPSK" w:cs="TH SarabunPSK"/>
-                <w:sz w:val="32"/>
-                <w:szCs w:val="32"/>
-              </w:rPr>
-            </w:pPr>
-          </w:p>
-        </w:tc>
-        <w:tc>
-          <w:tcPr>
-            <w:tcW w:w="4535" w:type="dxa"/>
-            <w:shd w:val="clear" w:color="auto" w:fill="auto"/>
-          </w:tcPr>
-          <w:p>
-            <w:pPr>
-              <w:jc w:val="center"/>
-              <w:rPr>
-                <w:rFonts w:ascii="TH SarabunPSK" w:hAnsi="TH SarabunPSK" w:cs="TH SarabunPSK"/>
-                <w:color w:val="auto"/>
-                <w:sz w:val="32"/>
-                <w:szCs w:val="32"/>
-                <w:cs/>
-              </w:rPr>
-            </w:pPr>
-            <w:r>
-              <w:rPr>
-                <w:rFonts w:ascii="TH Sarabun New" w:hAnsi="TH Sarabun New" w:cs="TH Sarabun New"/>
-                <w:color w:val="auto"/>
+                <w:color w:val="FFFFFF" w:themeColor="background1"/>
                 <w:sz w:val="32"/>
                 <w:szCs w:val="32"/>
                 <w:cs/>

</xml_diff>